<commit_message>
v2: fix inner-fold leakage and calibration labels, rerun, add review analyses
- Inner tuning folds respect the h + release-lag gap; imputer/scaler fitted per inner fold
- Expanding calibration history relabelled with the current fold threshold
- Timing audit for every fold, horizon and stage (Table S16)
- Reran steps 3-6b; v1 outputs archived in outputs/archive_v1, change table v1->v2
- E21 paired ablation intervals, E22 strict early warning, E23 reviewer-error models
  and expected-loss routing, S17 countries by fold
- step10 post-hoc 2023-2025 rerun (frozen confirmation untouched, not rescored)
- Extended consistency audit (PASS); manuscript rebuilt from reviewer-revised text
</commit_message>
<xml_diff>
--- a/manuscript/Highlights.docx
+++ b/manuscript/Highlights.docx
@@ -20,7 +20,7 @@
         </w:numPr>
       </w:pPr>
       <w:r>
-        <w:t xml:space="preserve">Reported panel threshold F statistics are reproduced exactly from the original data</w:t>
+        <w:t xml:space="preserve">A reproducibility audit connects threshold evidence with stress prediction</w:t>
       </w:r>
     </w:p>
     <w:p>
@@ -32,7 +32,7 @@
         </w:numPr>
       </w:pPr>
       <w:r>
-        <w:t xml:space="preserve">Threshold effects weaken under standard trimming and publication lags</w:t>
+        <w:t xml:space="preserve">No FX-share ablation reaches a 0.02 gain in average precision</w:t>
       </w:r>
     </w:p>
     <w:p>
@@ -44,7 +44,7 @@
         </w:numPr>
       </w:pPr>
       <w:r>
-        <w:t xml:space="preserve">Currency and institution features do not add detectable forecast value</w:t>
+        <w:t xml:space="preserve">Model rankings change across periods, countries and stress definitions</w:t>
       </w:r>
     </w:p>
     <w:p>
@@ -56,7 +56,7 @@
         </w:numPr>
       </w:pPr>
       <w:r>
-        <w:t xml:space="preserve">No learned model beats a persistence rule by a meaningful margin</w:t>
+        <w:t xml:space="preserve">Simulated review gains depend on accuracy, costs and the comparison policy</w:t>
       </w:r>
     </w:p>
     <w:p>
@@ -68,7 +68,7 @@
         </w:numPr>
       </w:pPr>
       <w:r>
-        <w:t xml:space="preserve">A pre-specified fallback rule is tested on 2023-2025 data</w:t>
+        <w:t xml:space="preserve">A frozen fallback misses gains from an unmonitored model in the core sample</w:t>
       </w:r>
     </w:p>
     <w:bookmarkEnd w:id="9"/>

</xml_diff>

<commit_message>
Inner-fold event thresholds from inner training targets; rerun steps 3-6b and 10; port revised manuscript (corrected extension as main evidence, Appendix A archive); episode and precision consistency checks; author check responses
</commit_message>
<xml_diff>
--- a/manuscript/Highlights.docx
+++ b/manuscript/Highlights.docx
@@ -32,7 +32,7 @@
         </w:numPr>
       </w:pPr>
       <w:r>
-        <w:t xml:space="preserve">No FX-share ablation reaches a 0.02 gain in average precision</w:t>
+        <w:t xml:space="preserve">Only one of 18 CI or IQ additions reaches a 0.02 gain in average precision</w:t>
       </w:r>
     </w:p>
     <w:p>
@@ -56,7 +56,7 @@
         </w:numPr>
       </w:pPr>
       <w:r>
-        <w:t xml:space="preserve">Simulated review gains depend on accuracy, costs and the comparison policy</w:t>
+        <w:t xml:space="preserve">Simulated review gains depend on reviewer errors, fees and the comparison policy</w:t>
       </w:r>
     </w:p>
     <w:p>
@@ -68,7 +68,7 @@
         </w:numPr>
       </w:pPr>
       <w:r>
-        <w:t xml:space="preserve">A frozen fallback misses gains from an unmonitored model in the core sample</w:t>
+        <w:t xml:space="preserve">A refitted fallback keeps persistence and misses XGBoost gains in core economies</w:t>
       </w:r>
     </w:p>
     <w:bookmarkEnd w:id="9"/>

</xml_diff>